<commit_message>
content: apply round-2 owner answers; privacy retention sentence
- Ministry registration stated accurately; drop 'below Ministry minimums'.
- Remove unconfirmed claims: continuously staffed front desk, every-staff
  checks/certification, multilingual educators, termly/quarterly drills.
- Screens and vaccinations now follow the nursery's own Media Viewing and
  Enrollment policies; drills 'practiced regularly' (Fire policy says
  monthly: flagged for the owner).
- Privacy policy: owner-approved six-month retention sentence for
  non-enrolling enquiries; PDF/DOCX regenerated (sign-off pending signer
  name). No automatic deletion implemented.
- Guard test extended; frontend 42/42; build and browser checks pass.

Co-Authored-By: Claude Opus 5.5 <noreply@anthropic.com>
Claude-Session: https://claude.ai/code/session_01BnHtQtiGZWmJVupARcbjTj
</commit_message>
<xml_diff>
--- a/frontend/public/policies-docs/Privacy and Confidentiality Policy.docx
+++ b/frontend/public/policies-docs/Privacy and Confidentiality Policy.docx
@@ -401,6 +401,21 @@
           <w:sz w:val="21"/>
         </w:rPr>
         <w:t>Physical records are kept in locked storage; electronic records on secure, password-protected systems with encryption, firewalls and access controls. Information is retained only as long as necessary for its purpose or as required by law, then securely disposed of.</w:t>
+      </w:r>
+    </w:p>
+    <w:p>
+      <w:pPr>
+        <w:spacing w:after="120" w:line="324" w:lineRule="auto"/>
+      </w:pPr>
+      <w:r>
+        <w:rPr>
+          <w:rFonts w:ascii="Arial" w:hAnsi="Arial" w:eastAsia="Arial"/>
+          <w:b w:val="0"/>
+          <w:i w:val="0"/>
+          <w:color w:val="1F1F1F"/>
+          <w:sz w:val="21"/>
+        </w:rPr>
+        <w:t>Enquiries from families who do not enrol are deleted six months after they are received.</w:t>
       </w:r>
     </w:p>
     <w:p>
@@ -1082,7 +1097,7 @@
                 <w:color w:val="1F1F1F"/>
                 <w:sz w:val="18"/>
               </w:rPr>
-              <w:t>Added Newsletter Sign-Up section (text approved by the owner)</w:t>
+              <w:t>Added Newsletter Sign-Up section and six-month retention for enquiries (approved by the owner)</w:t>
             </w:r>
           </w:p>
         </w:tc>

</xml_diff>